<commit_message>
[feature] 统一 API 前缀到 /api/v1/clause_splitter;新增冒烟测试脚本
</commit_message>
<xml_diff>
--- a/assets/外规内化服务接口文档.docx
+++ b/assets/外规内化服务接口文档.docx
@@ -211,7 +211,7 @@
                 <w:b w:val="0"/>
                 <w:sz w:val="19"/>
               </w:rPr>
-              <w:t>/api/v1/regulations/push</w:t>
+              <w:t>/api/v1/clause_splitter/regulations/push</w:t>
             </w:r>
           </w:p>
         </w:tc>
@@ -289,7 +289,7 @@
                 <w:b w:val="0"/>
                 <w:sz w:val="19"/>
               </w:rPr>
-              <w:t>/api/v1/regulations/{docId}/result</w:t>
+              <w:t>/api/v1/clause_splitter/regulations/{docId}/result</w:t>
             </w:r>
           </w:p>
         </w:tc>
@@ -1120,7 +1120,7 @@
         <w:pStyle w:val="Heading2"/>
       </w:pPr>
       <w:r>
-        <w:t>3.2 请求体(POST /api/v1/regulations/push)</w:t>
+        <w:t>3.2 请求体(POST /api/v1/clause_splitter/regulations/push)</w:t>
       </w:r>
     </w:p>
     <w:tbl>
@@ -5081,7 +5081,7 @@
           <w:b w:val="0"/>
           <w:sz w:val="21"/>
         </w:rPr>
-        <w:t>GET /api/v1/regulations/{docId}/result,响应为统一外层信封 {code, status, data, msg},其中 data 为 5.1 的结果报文;外层 code 为 "200" 表示查询成功,业务结果以报文内的 code 为准。</w:t>
+        <w:t>GET /api/v1/clause_splitter/regulations/{docId}/result,响应为统一外层信封 {code, status, data, msg},其中 data 为 5.1 的结果报文;外层 code 为 "200" 表示查询成功,业务结果以报文内的 code 为准。</w:t>
       </w:r>
     </w:p>
     <w:p>
@@ -5133,7 +5133,7 @@
                 <w:b w:val="0"/>
                 <w:sz w:val="17"/>
               </w:rPr>
-              <w:t>curl -X POST 'http://&lt;服务地址&gt;:18998/api/v1/regulations/push' \</w:t>
+              <w:t>curl -X POST 'http://&lt;服务地址&gt;:18998/api/v1/clause_splitter/regulations/push' \</w:t>
             </w:r>
           </w:p>
           <w:p>
@@ -5562,6 +5562,7 @@
     </w:p>
     <w:sectPr>
       <w:footerReference w:type="default" r:id="rId9"/>
+      <w:headerReference w:type="default" r:id="rId10"/>
       <w:pgSz w:w="11906" w:h="16838"/>
       <w:pgMar w:top="1361" w:right="1417" w:bottom="1361" w:left="1417" w:header="720" w:footer="720" w:gutter="0"/>
       <w:cols w:space="720"/>
@@ -5606,6 +5607,16 @@
     </w:r>
   </w:p>
 </w:ftr>
+</file>
+
+<file path=word/header1.xml><?xml version="1.0" encoding="utf-8"?>
+<w:hdr xmlns:m="http://schemas.openxmlformats.org/officeDocument/2006/math" xmlns:mc="http://schemas.openxmlformats.org/markup-compatibility/2006" xmlns:mo="http://schemas.microsoft.com/office/mac/office/2008/main" xmlns:mv="urn:schemas-microsoft-com:mac:vml" xmlns:o="urn:schemas-microsoft-com:office:office" xmlns:r="http://schemas.openxmlformats.org/officeDocument/2006/relationships" xmlns:v="urn:schemas-microsoft-com:vml" xmlns:w10="urn:schemas-microsoft-com:office:word" xmlns:w14="http://schemas.microsoft.com/office/word/2010/wordml" xmlns:w="http://schemas.openxmlformats.org/wordprocessingml/2006/main" xmlns:wne="http://schemas.microsoft.com/office/word/2006/wordml" xmlns:wp14="http://schemas.microsoft.com/office/word/2010/wordprocessingDrawing" xmlns:wp="http://schemas.openxmlformats.org/drawingml/2006/wordprocessingDrawing" xmlns:wpc="http://schemas.microsoft.com/office/word/2010/wordprocessingCanvas" xmlns:wpg="http://schemas.microsoft.com/office/word/2010/wordprocessingGroup" xmlns:wpi="http://schemas.microsoft.com/office/word/2010/wordprocessingInk" xmlns:wps="http://schemas.microsoft.com/office/word/2010/wordprocessingShape" mc:Ignorable="w14 wp14">
+  <w:p>
+    <w:pPr>
+      <w:pStyle w:val="Header"/>
+    </w:pPr>
+  </w:p>
+</w:hdr>
 </file>
 
 <file path=word/numbering.xml><?xml version="1.0" encoding="utf-8"?>

</xml_diff>

<commit_message>
[feature] 出参扁平化;RAG 改为外接 HTTP 服务(移除 chillrag)
出参:
- 顶层扁平返回 code/msg/docId/docKeyword/docType/docAbstract/taskId/applicable/applicableReason/data
- data 恒为数组;条款键改为 chapter/orderNum/relationTerms/termContent/termId/termKeyword/
  termName/internalize/internalizeReason/coverageStatus/analysis/differenceAnalysis/
  coreRequirements/remedySuggestion,orderNum 自 "0" 起,termId={docId}-{orderNum}
- 移除 extraParams/clauseType;一次文档级 LLM 调用产出摘要与关键词,termKeyword 走 jieba
- GET /regulations/{docId}/result 返回同一扁平 payload

RAG 外接化:
- 删除 chillrag/ 整包与 compare/{ingest,index}.py;新增 rag/(types/protocols/client/errors),
  parsing/(blocks/normalize/local/router),agent/(ReAct + ToolRegistry),split/chunker.py
- 解析、分块、索引、检索全部走外部 HTTP;RagService 为唯一抽象,业务代码只依赖它
- 外规解析远端优先,失败回退本地纯文本抽取(PARSE_FALLBACK=local|none),不使用 MinerU
- 远端调用经 asyncio.to_thread,不阻塞事件循环;内规库转发远端入库/删除/状态,Mongo 只留镜像
- 新增 assets/rag-service-contract.md;依赖清理(pyserini/faiss/sentence-transformers/mineru/torch)
</commit_message>
<xml_diff>
--- a/assets/外规内化服务接口文档.docx
+++ b/assets/外规内化服务接口文档.docx
@@ -28,7 +28,7 @@
           <w:color w:val="666666"/>
           <w:sz w:val="20"/>
         </w:rPr>
-        <w:t>Clause_Splitter · v0.4.0 · 2026-10-25</w:t>
+        <w:t>Clause_Splitter · v0.5.0 · 2026-10-26</w:t>
       </w:r>
     </w:p>
     <w:p>
@@ -2072,7 +2072,7 @@
                 <w:b w:val="0"/>
                 <w:sz w:val="19"/>
               </w:rPr>
-              <w:t>否</w:t>
+              <w:t>扩展参数(JSON 对象);原样保存以兼容旧调用,但不出现在回调/查询报文中。不参与流程判定,未传时为 {}。</w:t>
             </w:r>
           </w:p>
         </w:tc>
@@ -3576,7 +3576,7 @@
           <w:color w:val="555555"/>
           <w:sz w:val="19"/>
         </w:rPr>
-        <w:t>说明:外层 code=200 表示请求被正确处理;业务结果以回调或查询报文中的 code 为准。</w:t>
+        <w:t>说明：推送响应外层 code=200 表示请求被正确处理;业务结果以回调或查询报文中的 code 为准。</w:t>
       </w:r>
     </w:p>
     <w:p>
@@ -3606,7 +3606,7 @@
           <w:b w:val="0"/>
           <w:sz w:val="21"/>
         </w:rPr>
-        <w:t>结果查询返回的 data 与 ESG 回调的 body 为同一份报文,结构如下:</w:t>
+        <w:t>结果查询直接返回与 ESG 回调 body 完全一致的扁平报文(不再套外层信封):文档级字段在顶层,条款级结果全部放在 data 数组中,结构如下:</w:t>
       </w:r>
     </w:p>
     <w:tbl>
@@ -3635,7 +3635,6 @@
             <w:pPr>
               <w:spacing w:after="0" w:line="240" w:lineRule="auto"/>
             </w:pPr>
-            <w:r/>
             <w:r>
               <w:rPr>
                 <w:rFonts w:ascii="Consolas" w:hAnsi="Consolas" w:eastAsia="宋体"/>
@@ -3681,7 +3680,7 @@
                 <w:b w:val="0"/>
                 <w:sz w:val="17"/>
               </w:rPr>
-              <w:t xml:space="preserve">  "extraParams": { "source": "iobs", "batch": "2026-10" },</w:t>
+              <w:t xml:space="preserve">  "docId": "REG20261023001",</w:t>
             </w:r>
           </w:p>
           <w:p>
@@ -3694,7 +3693,7 @@
                 <w:b w:val="0"/>
                 <w:sz w:val="17"/>
               </w:rPr>
-              <w:t xml:space="preserve">  "metadata": { "docId": "REG20261023001", "taskId": "TASK20261023001",</w:t>
+              <w:t xml:space="preserve">  "docKeyword": "数据安全, 风险管理, 信息披露",</w:t>
             </w:r>
           </w:p>
           <w:p>
@@ -3707,7 +3706,7 @@
                 <w:b w:val="0"/>
                 <w:sz w:val="17"/>
               </w:rPr>
-              <w:t xml:space="preserve">                "uid": "U10086", "docType": "2", "optType": 1 },</w:t>
+              <w:t xml:space="preserve">  "docType": "2",</w:t>
             </w:r>
           </w:p>
           <w:p>
@@ -3720,7 +3719,7 @@
                 <w:b w:val="0"/>
                 <w:sz w:val="17"/>
               </w:rPr>
-              <w:t xml:space="preserve">  "stages": { "applicability": "done", "split": "done",</w:t>
+              <w:t xml:space="preserve">  "docAbstract": "本规范明确数据处理活动的合法、正当、必要原则,要求建立数据安全管理制度并开展风险评估。",</w:t>
             </w:r>
           </w:p>
           <w:p>
@@ -3733,7 +3732,7 @@
                 <w:b w:val="0"/>
                 <w:sz w:val="17"/>
               </w:rPr>
-              <w:t xml:space="preserve">              "internalization": "done", "analysis": "done" },</w:t>
+              <w:t xml:space="preserve">  "taskId": "TASK20261023001",</w:t>
             </w:r>
           </w:p>
           <w:p>
@@ -3746,7 +3745,7 @@
                 <w:b w:val="0"/>
                 <w:sz w:val="17"/>
               </w:rPr>
-              <w:t xml:space="preserve">  "data": {</w:t>
+              <w:t xml:space="preserve">  "applicable": true,</w:t>
             </w:r>
           </w:p>
           <w:p>
@@ -3759,7 +3758,7 @@
                 <w:b w:val="0"/>
                 <w:sz w:val="17"/>
               </w:rPr>
-              <w:t xml:space="preserve">    "applicability": { "applicable": true, "reason": "适用于平安科技。" },</w:t>
+              <w:t xml:space="preserve">  "applicableReason": "适用于平安科技。",</w:t>
             </w:r>
           </w:p>
           <w:p>
@@ -3772,7 +3771,7 @@
                 <w:b w:val="0"/>
                 <w:sz w:val="17"/>
               </w:rPr>
-              <w:t xml:space="preserve">    "split": {</w:t>
+              <w:t xml:space="preserve">  "data": [</w:t>
             </w:r>
           </w:p>
           <w:p>
@@ -3785,7 +3784,7 @@
                 <w:b w:val="0"/>
                 <w:sz w:val="17"/>
               </w:rPr>
-              <w:t xml:space="preserve">      "clauseCount": 1,</w:t>
+              <w:t xml:space="preserve">    {</w:t>
             </w:r>
           </w:p>
           <w:p>
@@ -3798,7 +3797,7 @@
                 <w:b w:val="0"/>
                 <w:sz w:val="17"/>
               </w:rPr>
-              <w:t xml:space="preserve">      "clauses": [</w:t>
+              <w:t xml:space="preserve">      "chapter": "一、总体要求",</w:t>
             </w:r>
           </w:p>
           <w:p>
@@ -3811,7 +3810,7 @@
                 <w:b w:val="0"/>
                 <w:sz w:val="17"/>
               </w:rPr>
-              <w:t xml:space="preserve">        { "clauseId": "REG20261023001_1", "orderNum": 1, "chapter": "一、总体要求",</w:t>
+              <w:t xml:space="preserve">      "orderNum": "0",</w:t>
             </w:r>
           </w:p>
           <w:p>
@@ -3824,7 +3823,7 @@
                 <w:b w:val="0"/>
                 <w:sz w:val="17"/>
               </w:rPr>
-              <w:t xml:space="preserve">          "clauseName": "第一条",</w:t>
+              <w:t xml:space="preserve">      "relationTerms": [</w:t>
             </w:r>
           </w:p>
           <w:p>
@@ -3837,7 +3836,7 @@
                 <w:b w:val="0"/>
                 <w:sz w:val="17"/>
               </w:rPr>
-              <w:t xml:space="preserve">          "clauseContent": "数据处理活动应当遵循合法、正当、必要和诚信原则。" }</w:t>
+              <w:t xml:space="preserve">        {</w:t>
             </w:r>
           </w:p>
           <w:p>
@@ -3850,7 +3849,7 @@
                 <w:b w:val="0"/>
                 <w:sz w:val="17"/>
               </w:rPr>
-              <w:t xml:space="preserve">      ]</w:t>
+              <w:t xml:space="preserve">          "internalClauseId": "数据安全管理办法#3",</w:t>
             </w:r>
           </w:p>
           <w:p>
@@ -3863,7 +3862,7 @@
                 <w:b w:val="0"/>
                 <w:sz w:val="17"/>
               </w:rPr>
-              <w:t xml:space="preserve">    },</w:t>
+              <w:t xml:space="preserve">          "docName": "数据安全管理办法",</w:t>
             </w:r>
           </w:p>
           <w:p>
@@ -3876,7 +3875,7 @@
                 <w:b w:val="0"/>
                 <w:sz w:val="17"/>
               </w:rPr>
-              <w:t xml:space="preserve">    "internalization": {</w:t>
+              <w:t xml:space="preserve">          "clauseName": "第三条",</w:t>
             </w:r>
           </w:p>
           <w:p>
@@ -3889,7 +3888,7 @@
                 <w:b w:val="0"/>
                 <w:sz w:val="17"/>
               </w:rPr>
-              <w:t xml:space="preserve">      "clauses": [</w:t>
+              <w:t xml:space="preserve">          "clauseContent": "数据处理应遵循合法、正当、必要原则。"</w:t>
             </w:r>
           </w:p>
           <w:p>
@@ -3902,7 +3901,7 @@
                 <w:b w:val="0"/>
                 <w:sz w:val="17"/>
               </w:rPr>
-              <w:t xml:space="preserve">        { "clauseId": "REG20261023001_1", "clauseType": "义务性条款",</w:t>
+              <w:t xml:space="preserve">        }</w:t>
             </w:r>
           </w:p>
           <w:p>
@@ -3915,7 +3914,7 @@
                 <w:b w:val="0"/>
                 <w:sz w:val="17"/>
               </w:rPr>
-              <w:t xml:space="preserve">          "internalize": "需要内化",</w:t>
+              <w:t xml:space="preserve">      ],</w:t>
             </w:r>
           </w:p>
           <w:p>
@@ -3928,7 +3927,7 @@
                 <w:b w:val="0"/>
                 <w:sz w:val="17"/>
               </w:rPr>
-              <w:t xml:space="preserve">          "internalizeReason": "提出明确的数据处理合规义务。" }</w:t>
+              <w:t xml:space="preserve">      "termContent": "数据处理活动应当遵循合法、正当、必要和诚信原则。",</w:t>
             </w:r>
           </w:p>
           <w:p>
@@ -3941,7 +3940,7 @@
                 <w:b w:val="0"/>
                 <w:sz w:val="17"/>
               </w:rPr>
-              <w:t xml:space="preserve">      ]</w:t>
+              <w:t xml:space="preserve">      "termId": "REG20261023001-0",</w:t>
             </w:r>
           </w:p>
           <w:p>
@@ -3954,7 +3953,7 @@
                 <w:b w:val="0"/>
                 <w:sz w:val="17"/>
               </w:rPr>
-              <w:t xml:space="preserve">    },</w:t>
+              <w:t xml:space="preserve">      "termKeyword": "数据处理, 诚信原则, 合规义务",</w:t>
             </w:r>
           </w:p>
           <w:p>
@@ -3967,7 +3966,7 @@
                 <w:b w:val="0"/>
                 <w:sz w:val="17"/>
               </w:rPr>
-              <w:t xml:space="preserve">    "analysis": {</w:t>
+              <w:t xml:space="preserve">      "termName": "第一条",</w:t>
             </w:r>
           </w:p>
           <w:p>
@@ -3980,7 +3979,7 @@
                 <w:b w:val="0"/>
                 <w:sz w:val="17"/>
               </w:rPr>
-              <w:t xml:space="preserve">      "coverageRate": "1/1", "fullyCoveredCount": 1, "partiallyCoveredCount": 0,</w:t>
+              <w:t xml:space="preserve">      "internalize": "需要内化",</w:t>
             </w:r>
           </w:p>
           <w:p>
@@ -3993,7 +3992,7 @@
                 <w:b w:val="0"/>
                 <w:sz w:val="17"/>
               </w:rPr>
-              <w:t xml:space="preserve">      "missingCount": 0, "internalizableCount": 1, "noInternalizationCount": 0,</w:t>
+              <w:t xml:space="preserve">      "internalizeReason": "提出明确的数据处理合规义务。",</w:t>
             </w:r>
           </w:p>
           <w:p>
@@ -4006,7 +4005,7 @@
                 <w:b w:val="0"/>
                 <w:sz w:val="17"/>
               </w:rPr>
-              <w:t xml:space="preserve">      "clauses": [</w:t>
+              <w:t xml:space="preserve">      "coverageStatus": "完全覆盖",</w:t>
             </w:r>
           </w:p>
           <w:p>
@@ -4019,7 +4018,7 @@
                 <w:b w:val="0"/>
                 <w:sz w:val="17"/>
               </w:rPr>
-              <w:t xml:space="preserve">        { "clauseId": "REG20261023001_1", "coverageStatus": "完全覆盖",</w:t>
+              <w:t xml:space="preserve">      "analysis": "内部制度已覆盖该原则。",</w:t>
             </w:r>
           </w:p>
           <w:p>
@@ -4032,7 +4031,7 @@
                 <w:b w:val="0"/>
                 <w:sz w:val="17"/>
               </w:rPr>
-              <w:t xml:space="preserve">          "analysis": "内部制度已覆盖该原则。", "differenceAnalysis": "",</w:t>
+              <w:t xml:space="preserve">      "differenceAnalysis": "",</w:t>
             </w:r>
           </w:p>
           <w:p>
@@ -4045,7 +4044,7 @@
                 <w:b w:val="0"/>
                 <w:sz w:val="17"/>
               </w:rPr>
-              <w:t xml:space="preserve">          "coreRequirements": "1)、遵循合法、正当、必要和诚信原则。",</w:t>
+              <w:t xml:space="preserve">      "coreRequirements": "1)、遵循合法、正当、必要和诚信原则。",</w:t>
             </w:r>
           </w:p>
           <w:p>
@@ -4058,7 +4057,7 @@
                 <w:b w:val="0"/>
                 <w:sz w:val="17"/>
               </w:rPr>
-              <w:t xml:space="preserve">          "remedySuggestion": "无需整改。",</w:t>
+              <w:t xml:space="preserve">      "remedySuggestion": "无需整改。"</w:t>
             </w:r>
           </w:p>
           <w:p>
@@ -4071,7 +4070,7 @@
                 <w:b w:val="0"/>
                 <w:sz w:val="17"/>
               </w:rPr>
-              <w:t xml:space="preserve">          "relationClauses": [</w:t>
+              <w:t xml:space="preserve">    }</w:t>
             </w:r>
           </w:p>
           <w:p>
@@ -4084,85 +4083,7 @@
                 <w:b w:val="0"/>
                 <w:sz w:val="17"/>
               </w:rPr>
-              <w:t xml:space="preserve">            { "internalClauseId": "数据安全管理办法#3", "docName": "数据安全管理办法",</w:t>
-            </w:r>
-          </w:p>
-          <w:p>
-            <w:pPr>
-              <w:spacing w:after="0" w:line="240" w:lineRule="auto"/>
-            </w:pPr>
-            <w:r>
-              <w:rPr>
-                <w:rFonts w:ascii="Consolas" w:hAnsi="Consolas" w:eastAsia="宋体"/>
-                <w:b w:val="0"/>
-                <w:sz w:val="17"/>
-              </w:rPr>
-              <w:t xml:space="preserve">              "clauseName": "第三条",</w:t>
-            </w:r>
-          </w:p>
-          <w:p>
-            <w:pPr>
-              <w:spacing w:after="0" w:line="240" w:lineRule="auto"/>
-            </w:pPr>
-            <w:r>
-              <w:rPr>
-                <w:rFonts w:ascii="Consolas" w:hAnsi="Consolas" w:eastAsia="宋体"/>
-                <w:b w:val="0"/>
-                <w:sz w:val="17"/>
-              </w:rPr>
-              <w:t xml:space="preserve">              "clauseContent": "数据处理应遵循合法、正当、必要原则。" }</w:t>
-            </w:r>
-          </w:p>
-          <w:p>
-            <w:pPr>
-              <w:spacing w:after="0" w:line="240" w:lineRule="auto"/>
-            </w:pPr>
-            <w:r>
-              <w:rPr>
-                <w:rFonts w:ascii="Consolas" w:hAnsi="Consolas" w:eastAsia="宋体"/>
-                <w:b w:val="0"/>
-                <w:sz w:val="17"/>
-              </w:rPr>
-              <w:t xml:space="preserve">          ] }</w:t>
-            </w:r>
-          </w:p>
-          <w:p>
-            <w:pPr>
-              <w:spacing w:after="0" w:line="240" w:lineRule="auto"/>
-            </w:pPr>
-            <w:r>
-              <w:rPr>
-                <w:rFonts w:ascii="Consolas" w:hAnsi="Consolas" w:eastAsia="宋体"/>
-                <w:b w:val="0"/>
-                <w:sz w:val="17"/>
-              </w:rPr>
-              <w:t xml:space="preserve">      ]</w:t>
-            </w:r>
-          </w:p>
-          <w:p>
-            <w:pPr>
-              <w:spacing w:after="0" w:line="240" w:lineRule="auto"/>
-            </w:pPr>
-            <w:r>
-              <w:rPr>
-                <w:rFonts w:ascii="Consolas" w:hAnsi="Consolas" w:eastAsia="宋体"/>
-                <w:b w:val="0"/>
-                <w:sz w:val="17"/>
-              </w:rPr>
-              <w:t xml:space="preserve">    }</w:t>
-            </w:r>
-          </w:p>
-          <w:p>
-            <w:pPr>
-              <w:spacing w:after="0" w:line="240" w:lineRule="auto"/>
-            </w:pPr>
-            <w:r>
-              <w:rPr>
-                <w:rFonts w:ascii="Consolas" w:hAnsi="Consolas" w:eastAsia="宋体"/>
-                <w:b w:val="0"/>
-                <w:sz w:val="17"/>
-              </w:rPr>
-              <w:t xml:space="preserve">  }</w:t>
+              <w:t xml:space="preserve">  ]</w:t>
             </w:r>
           </w:p>
           <w:p>
@@ -4288,7 +4209,6 @@
             <w:pPr>
               <w:spacing w:after="0" w:line="276" w:lineRule="auto"/>
             </w:pPr>
-            <w:r/>
             <w:r>
               <w:rPr>
                 <w:rFonts w:ascii="宋体" w:hAnsi="宋体" w:eastAsia="宋体"/>
@@ -4307,7 +4227,6 @@
             <w:pPr>
               <w:spacing w:after="0" w:line="276" w:lineRule="auto"/>
             </w:pPr>
-            <w:r/>
             <w:r>
               <w:rPr>
                 <w:rFonts w:ascii="宋体" w:hAnsi="宋体" w:eastAsia="宋体"/>
@@ -4326,7 +4245,6 @@
             <w:pPr>
               <w:spacing w:after="0" w:line="276" w:lineRule="auto"/>
             </w:pPr>
-            <w:r/>
             <w:r>
               <w:rPr>
                 <w:rFonts w:ascii="宋体" w:hAnsi="宋体" w:eastAsia="宋体"/>
@@ -4347,7 +4265,6 @@
             <w:pPr>
               <w:spacing w:after="0" w:line="276" w:lineRule="auto"/>
             </w:pPr>
-            <w:r/>
             <w:r>
               <w:rPr>
                 <w:rFonts w:ascii="宋体" w:hAnsi="宋体" w:eastAsia="宋体"/>
@@ -4366,7 +4283,6 @@
             <w:pPr>
               <w:spacing w:after="0" w:line="276" w:lineRule="auto"/>
             </w:pPr>
-            <w:r/>
             <w:r>
               <w:rPr>
                 <w:rFonts w:ascii="宋体" w:hAnsi="宋体" w:eastAsia="宋体"/>
@@ -4385,14 +4301,13 @@
             <w:pPr>
               <w:spacing w:after="0" w:line="276" w:lineRule="auto"/>
             </w:pPr>
-            <w:r/>
             <w:r>
               <w:rPr>
                 <w:rFonts w:ascii="宋体" w:hAnsi="宋体" w:eastAsia="宋体"/>
                 <w:b w:val="0"/>
                 <w:sz w:val="19"/>
               </w:rPr>
-              <w:t>结果说明</w:t>
+              <w:t>code=1 时为"成功"或终止原因;code=0 为错误摘要;code=2 为"处理中"</w:t>
             </w:r>
           </w:p>
         </w:tc>
@@ -4412,7 +4327,7 @@
                 <w:b w:val="0"/>
                 <w:sz w:val="19"/>
               </w:rPr>
-              <w:t>extraParams</w:t>
+              <w:t>docId</w:t>
             </w:r>
           </w:p>
         </w:tc>
@@ -4430,7 +4345,7 @@
                 <w:b w:val="0"/>
                 <w:sz w:val="19"/>
               </w:rPr>
-              <w:t>Object</w:t>
+              <w:t>String</w:t>
             </w:r>
           </w:p>
         </w:tc>
@@ -4448,7 +4363,7 @@
                 <w:b w:val="0"/>
                 <w:sz w:val="19"/>
               </w:rPr>
-              <w:t>推送入参 extraParams 原样回显(JSON 对象,顶层字段);未传时为 {}。请勿放入 token、密钥等敏感信息。</w:t>
+              <w:t>推送入参 docId;结果查询与回调的唯一定位依据</w:t>
             </w:r>
           </w:p>
         </w:tc>
@@ -4462,14 +4377,13 @@
             <w:pPr>
               <w:spacing w:after="0" w:line="276" w:lineRule="auto"/>
             </w:pPr>
-            <w:r/>
             <w:r>
               <w:rPr>
                 <w:rFonts w:ascii="宋体" w:hAnsi="宋体" w:eastAsia="宋体"/>
                 <w:b w:val="0"/>
                 <w:sz w:val="19"/>
               </w:rPr>
-              <w:t>metadata</w:t>
+              <w:t>docKeyword</w:t>
             </w:r>
           </w:p>
         </w:tc>
@@ -4481,14 +4395,13 @@
             <w:pPr>
               <w:spacing w:after="0" w:line="276" w:lineRule="auto"/>
             </w:pPr>
-            <w:r/>
             <w:r>
               <w:rPr>
                 <w:rFonts w:ascii="宋体" w:hAnsi="宋体" w:eastAsia="宋体"/>
                 <w:b w:val="0"/>
                 <w:sz w:val="19"/>
               </w:rPr>
-              <w:t>Object</w:t>
+              <w:t>String</w:t>
             </w:r>
           </w:p>
         </w:tc>
@@ -4506,9 +4419,7 @@
                 <w:b w:val="0"/>
                 <w:sz w:val="19"/>
               </w:rPr>
-              <w:t>推送入参回显:docId、taskId、uid、docType、optType;</w:t>
-              <w:br/>
-              <w:t>doclobsUrl 不回显</w:t>
+              <w:t>文档级关键词,逗号分隔;一次文档级 LLM 调用生成,失败时本地提词兜底</w:t>
             </w:r>
           </w:p>
         </w:tc>
@@ -4522,14 +4433,13 @@
             <w:pPr>
               <w:spacing w:after="0" w:line="276" w:lineRule="auto"/>
             </w:pPr>
-            <w:r/>
             <w:r>
               <w:rPr>
                 <w:rFonts w:ascii="宋体" w:hAnsi="宋体" w:eastAsia="宋体"/>
                 <w:b w:val="0"/>
                 <w:sz w:val="19"/>
               </w:rPr>
-              <w:t>stages</w:t>
+              <w:t>docType</w:t>
             </w:r>
           </w:p>
         </w:tc>
@@ -4541,14 +4451,13 @@
             <w:pPr>
               <w:spacing w:after="0" w:line="276" w:lineRule="auto"/>
             </w:pPr>
-            <w:r/>
             <w:r>
               <w:rPr>
                 <w:rFonts w:ascii="宋体" w:hAnsi="宋体" w:eastAsia="宋体"/>
                 <w:b w:val="0"/>
                 <w:sz w:val="19"/>
               </w:rPr>
-              <w:t>Object</w:t>
+              <w:t>String</w:t>
             </w:r>
           </w:p>
         </w:tc>
@@ -4560,27 +4469,13 @@
             <w:pPr>
               <w:spacing w:after="0" w:line="276" w:lineRule="auto"/>
             </w:pPr>
-            <w:r/>
             <w:r>
               <w:rPr>
                 <w:rFonts w:ascii="宋体" w:hAnsi="宋体" w:eastAsia="宋体"/>
                 <w:b w:val="0"/>
                 <w:sz w:val="19"/>
               </w:rPr>
-              <w:t>四阶段状态:applicability/split/internalization/analysis,</w:t>
-            </w:r>
-          </w:p>
-          <w:p>
-            <w:pPr>
-              <w:spacing w:after="0" w:line="276" w:lineRule="auto"/>
-            </w:pPr>
-            <w:r>
-              <w:rPr>
-                <w:rFonts w:ascii="宋体" w:hAnsi="宋体" w:eastAsia="宋体"/>
-                <w:b w:val="0"/>
-                <w:sz w:val="19"/>
-              </w:rPr>
-              <w:t>取值 done / failed / pending</w:t>
+              <w:t>推送入参 docType</w:t>
             </w:r>
           </w:p>
         </w:tc>
@@ -4594,14 +4489,13 @@
             <w:pPr>
               <w:spacing w:after="0" w:line="276" w:lineRule="auto"/>
             </w:pPr>
-            <w:r/>
             <w:r>
               <w:rPr>
                 <w:rFonts w:ascii="宋体" w:hAnsi="宋体" w:eastAsia="宋体"/>
                 <w:b w:val="0"/>
                 <w:sz w:val="19"/>
               </w:rPr>
-              <w:t>data.applicability</w:t>
+              <w:t>docAbstract</w:t>
             </w:r>
           </w:p>
         </w:tc>
@@ -4613,14 +4507,13 @@
             <w:pPr>
               <w:spacing w:after="0" w:line="276" w:lineRule="auto"/>
             </w:pPr>
-            <w:r/>
             <w:r>
               <w:rPr>
                 <w:rFonts w:ascii="宋体" w:hAnsi="宋体" w:eastAsia="宋体"/>
                 <w:b w:val="0"/>
                 <w:sz w:val="19"/>
               </w:rPr>
-              <w:t>Object</w:t>
+              <w:t>String</w:t>
             </w:r>
           </w:p>
         </w:tc>
@@ -4632,14 +4525,13 @@
             <w:pPr>
               <w:spacing w:after="0" w:line="276" w:lineRule="auto"/>
             </w:pPr>
-            <w:r/>
             <w:r>
               <w:rPr>
                 <w:rFonts w:ascii="宋体" w:hAnsi="宋体" w:eastAsia="宋体"/>
                 <w:b w:val="0"/>
                 <w:sz w:val="19"/>
               </w:rPr>
-              <w:t>{"applicable": true|false|null, "reason": "判定依据"}</w:t>
+              <w:t>文档级摘要(100–250 字);与 docKeyword 同一次 LLM 调用生成,失败时正文截取兜底</w:t>
             </w:r>
           </w:p>
         </w:tc>
@@ -4653,14 +4545,13 @@
             <w:pPr>
               <w:spacing w:after="0" w:line="276" w:lineRule="auto"/>
             </w:pPr>
-            <w:r/>
             <w:r>
               <w:rPr>
                 <w:rFonts w:ascii="宋体" w:hAnsi="宋体" w:eastAsia="宋体"/>
                 <w:b w:val="0"/>
                 <w:sz w:val="19"/>
               </w:rPr>
-              <w:t>data.split</w:t>
+              <w:t>taskId</w:t>
             </w:r>
           </w:p>
         </w:tc>
@@ -4672,14 +4563,13 @@
             <w:pPr>
               <w:spacing w:after="0" w:line="276" w:lineRule="auto"/>
             </w:pPr>
-            <w:r/>
             <w:r>
               <w:rPr>
                 <w:rFonts w:ascii="宋体" w:hAnsi="宋体" w:eastAsia="宋体"/>
                 <w:b w:val="0"/>
                 <w:sz w:val="19"/>
               </w:rPr>
-              <w:t>Object</w:t>
+              <w:t>String</w:t>
             </w:r>
           </w:p>
         </w:tc>
@@ -4691,27 +4581,13 @@
             <w:pPr>
               <w:spacing w:after="0" w:line="276" w:lineRule="auto"/>
             </w:pPr>
-            <w:r/>
             <w:r>
               <w:rPr>
                 <w:rFonts w:ascii="宋体" w:hAnsi="宋体" w:eastAsia="宋体"/>
                 <w:b w:val="0"/>
                 <w:sz w:val="19"/>
               </w:rPr>
-              <w:t>{"clauseCount": 条款数, "clauses": [{"clauseId", "orderNum",</w:t>
-            </w:r>
-          </w:p>
-          <w:p>
-            <w:pPr>
-              <w:spacing w:after="0" w:line="276" w:lineRule="auto"/>
-            </w:pPr>
-            <w:r>
-              <w:rPr>
-                <w:rFonts w:ascii="宋体" w:hAnsi="宋体" w:eastAsia="宋体"/>
-                <w:b w:val="0"/>
-                <w:sz w:val="19"/>
-              </w:rPr>
-              <w:t>"chapter", "clauseName", "clauseContent"}]}</w:t>
+              <w:t>推送入参 taskId</w:t>
             </w:r>
           </w:p>
         </w:tc>
@@ -4725,14 +4601,13 @@
             <w:pPr>
               <w:spacing w:after="0" w:line="276" w:lineRule="auto"/>
             </w:pPr>
-            <w:r/>
             <w:r>
               <w:rPr>
                 <w:rFonts w:ascii="宋体" w:hAnsi="宋体" w:eastAsia="宋体"/>
                 <w:b w:val="0"/>
                 <w:sz w:val="19"/>
               </w:rPr>
-              <w:t>data.internalization</w:t>
+              <w:t>applicable</w:t>
             </w:r>
           </w:p>
         </w:tc>
@@ -4744,14 +4619,13 @@
             <w:pPr>
               <w:spacing w:after="0" w:line="276" w:lineRule="auto"/>
             </w:pPr>
-            <w:r/>
             <w:r>
               <w:rPr>
                 <w:rFonts w:ascii="宋体" w:hAnsi="宋体" w:eastAsia="宋体"/>
                 <w:b w:val="0"/>
                 <w:sz w:val="19"/>
               </w:rPr>
-              <w:t>Object</w:t>
+              <w:t>Boolean</w:t>
             </w:r>
           </w:p>
         </w:tc>
@@ -4763,27 +4637,13 @@
             <w:pPr>
               <w:spacing w:after="0" w:line="276" w:lineRule="auto"/>
             </w:pPr>
-            <w:r/>
             <w:r>
               <w:rPr>
                 <w:rFonts w:ascii="宋体" w:hAnsi="宋体" w:eastAsia="宋体"/>
                 <w:b w:val="0"/>
                 <w:sz w:val="19"/>
               </w:rPr>
-              <w:t>{"clauses": [{"clauseId", "clauseType",</w:t>
-            </w:r>
-          </w:p>
-          <w:p>
-            <w:pPr>
-              <w:spacing w:after="0" w:line="276" w:lineRule="auto"/>
-            </w:pPr>
-            <w:r>
-              <w:rPr>
-                <w:rFonts w:ascii="宋体" w:hAnsi="宋体" w:eastAsia="宋体"/>
-                <w:b w:val="0"/>
-                <w:sz w:val="19"/>
-              </w:rPr>
-              <w:t>"internalize": "需要内化/无需内化", "internalizeReason"}]}</w:t>
+              <w:t>是否适用于平安科技:true / false / null(需人工复核)</w:t>
             </w:r>
           </w:p>
         </w:tc>
@@ -4797,14 +4657,13 @@
             <w:pPr>
               <w:spacing w:after="0" w:line="276" w:lineRule="auto"/>
             </w:pPr>
-            <w:r/>
             <w:r>
               <w:rPr>
                 <w:rFonts w:ascii="宋体" w:hAnsi="宋体" w:eastAsia="宋体"/>
                 <w:b w:val="0"/>
                 <w:sz w:val="19"/>
               </w:rPr>
-              <w:t>data.analysis</w:t>
+              <w:t>applicableReason</w:t>
             </w:r>
           </w:p>
         </w:tc>
@@ -4816,14 +4675,13 @@
             <w:pPr>
               <w:spacing w:after="0" w:line="276" w:lineRule="auto"/>
             </w:pPr>
-            <w:r/>
             <w:r>
               <w:rPr>
                 <w:rFonts w:ascii="宋体" w:hAnsi="宋体" w:eastAsia="宋体"/>
                 <w:b w:val="0"/>
                 <w:sz w:val="19"/>
               </w:rPr>
-              <w:t>Object</w:t>
+              <w:t>String</w:t>
             </w:r>
           </w:p>
         </w:tc>
@@ -4835,16 +4693,22 @@
             <w:pPr>
               <w:spacing w:after="0" w:line="276" w:lineRule="auto"/>
             </w:pPr>
-            <w:r/>
             <w:r>
               <w:rPr>
                 <w:rFonts w:ascii="宋体" w:hAnsi="宋体" w:eastAsia="宋体"/>
                 <w:b w:val="0"/>
                 <w:sz w:val="19"/>
               </w:rPr>
-              <w:t>{"coverageRate": "12/32", 各覆盖计数, "clauses":</w:t>
-            </w:r>
-          </w:p>
+              <w:t>适用性判定依据;无原因时为空串</w:t>
+            </w:r>
+          </w:p>
+        </w:tc>
+      </w:tr>
+      <w:tr>
+        <w:tc>
+          <w:tcPr>
+            <w:tcW w:type="dxa" w:w="2154"/>
+          </w:tcPr>
           <w:p>
             <w:pPr>
               <w:spacing w:after="0" w:line="276" w:lineRule="auto"/>
@@ -4855,9 +4719,14 @@
                 <w:b w:val="0"/>
                 <w:sz w:val="19"/>
               </w:rPr>
-              <w:t>[{"clauseId", "coverageStatus", "analysis", "differenceAnalysis",</w:t>
-            </w:r>
-          </w:p>
+              <w:t>data</w:t>
+            </w:r>
+          </w:p>
+        </w:tc>
+        <w:tc>
+          <w:tcPr>
+            <w:tcW w:type="dxa" w:w="1134"/>
+          </w:tcPr>
           <w:p>
             <w:pPr>
               <w:spacing w:after="0" w:line="276" w:lineRule="auto"/>
@@ -4868,9 +4737,14 @@
                 <w:b w:val="0"/>
                 <w:sz w:val="19"/>
               </w:rPr>
-              <w:t>"coreRequirements", "remedySuggestion", "relationClauses":</w:t>
-            </w:r>
-          </w:p>
+              <w:t>Array</w:t>
+            </w:r>
+          </w:p>
+        </w:tc>
+        <w:tc>
+          <w:tcPr>
+            <w:tcW w:type="dxa" w:w="5783"/>
+          </w:tcPr>
           <w:p>
             <w:pPr>
               <w:spacing w:after="0" w:line="276" w:lineRule="auto"/>
@@ -4881,7 +4755,1015 @@
                 <w:b w:val="0"/>
                 <w:sz w:val="19"/>
               </w:rPr>
-              <w:t>[{"internalClauseId", "docName", "clauseName", "clauseContent"}]}]}</w:t>
+              <w:t>条款数组,每个元素见下方 data[] 字段;永远不为 null,无条款时为 []</w:t>
+            </w:r>
+          </w:p>
+        </w:tc>
+      </w:tr>
+      <w:tr>
+        <w:tc>
+          <w:tcPr>
+            <w:tcW w:type="dxa" w:w="2154"/>
+          </w:tcPr>
+          <w:p>
+            <w:pPr>
+              <w:spacing w:after="0" w:line="276" w:lineRule="auto"/>
+            </w:pPr>
+            <w:r>
+              <w:rPr>
+                <w:rFonts w:ascii="宋体" w:hAnsi="宋体" w:eastAsia="宋体"/>
+                <w:b w:val="0"/>
+                <w:sz w:val="19"/>
+              </w:rPr>
+              <w:t>data[].chapter</w:t>
+            </w:r>
+          </w:p>
+        </w:tc>
+        <w:tc>
+          <w:tcPr>
+            <w:tcW w:type="dxa" w:w="1134"/>
+          </w:tcPr>
+          <w:p>
+            <w:pPr>
+              <w:spacing w:after="0" w:line="276" w:lineRule="auto"/>
+            </w:pPr>
+            <w:r>
+              <w:rPr>
+                <w:rFonts w:ascii="宋体" w:hAnsi="宋体" w:eastAsia="宋体"/>
+                <w:b w:val="0"/>
+                <w:sz w:val="19"/>
+              </w:rPr>
+              <w:t>String</w:t>
+            </w:r>
+          </w:p>
+        </w:tc>
+        <w:tc>
+          <w:tcPr>
+            <w:tcW w:type="dxa" w:w="5783"/>
+          </w:tcPr>
+          <w:p>
+            <w:pPr>
+              <w:spacing w:after="0" w:line="276" w:lineRule="auto"/>
+            </w:pPr>
+            <w:r>
+              <w:rPr>
+                <w:rFonts w:ascii="宋体" w:hAnsi="宋体" w:eastAsia="宋体"/>
+                <w:b w:val="0"/>
+                <w:sz w:val="19"/>
+              </w:rPr>
+              <w:t>所属章节路径(末级为条款号时已剔除),无章节为空串</w:t>
+            </w:r>
+          </w:p>
+        </w:tc>
+      </w:tr>
+      <w:tr>
+        <w:tc>
+          <w:tcPr>
+            <w:tcW w:type="dxa" w:w="2154"/>
+          </w:tcPr>
+          <w:p>
+            <w:pPr>
+              <w:spacing w:after="0" w:line="276" w:lineRule="auto"/>
+            </w:pPr>
+            <w:r>
+              <w:rPr>
+                <w:rFonts w:ascii="宋体" w:hAnsi="宋体" w:eastAsia="宋体"/>
+                <w:b w:val="0"/>
+                <w:sz w:val="19"/>
+              </w:rPr>
+              <w:t>data[].orderNum</w:t>
+            </w:r>
+          </w:p>
+        </w:tc>
+        <w:tc>
+          <w:tcPr>
+            <w:tcW w:type="dxa" w:w="1134"/>
+          </w:tcPr>
+          <w:p>
+            <w:pPr>
+              <w:spacing w:after="0" w:line="276" w:lineRule="auto"/>
+            </w:pPr>
+            <w:r>
+              <w:rPr>
+                <w:rFonts w:ascii="宋体" w:hAnsi="宋体" w:eastAsia="宋体"/>
+                <w:b w:val="0"/>
+                <w:sz w:val="19"/>
+              </w:rPr>
+              <w:t>String</w:t>
+            </w:r>
+          </w:p>
+        </w:tc>
+        <w:tc>
+          <w:tcPr>
+            <w:tcW w:type="dxa" w:w="5783"/>
+          </w:tcPr>
+          <w:p>
+            <w:pPr>
+              <w:spacing w:after="0" w:line="276" w:lineRule="auto"/>
+            </w:pPr>
+            <w:r>
+              <w:rPr>
+                <w:rFonts w:ascii="宋体" w:hAnsi="宋体" w:eastAsia="宋体"/>
+                <w:b w:val="0"/>
+                <w:sz w:val="19"/>
+              </w:rPr>
+              <w:t>条款顺序,字符串,从 "0" 开始</w:t>
+            </w:r>
+          </w:p>
+        </w:tc>
+      </w:tr>
+      <w:tr>
+        <w:tc>
+          <w:tcPr>
+            <w:tcW w:type="dxa" w:w="2154"/>
+          </w:tcPr>
+          <w:p>
+            <w:pPr>
+              <w:spacing w:after="0" w:line="276" w:lineRule="auto"/>
+            </w:pPr>
+            <w:r>
+              <w:rPr>
+                <w:rFonts w:ascii="宋体" w:hAnsi="宋体" w:eastAsia="宋体"/>
+                <w:b w:val="0"/>
+                <w:sz w:val="19"/>
+              </w:rPr>
+              <w:t>data[].relationTerms</w:t>
+            </w:r>
+          </w:p>
+        </w:tc>
+        <w:tc>
+          <w:tcPr>
+            <w:tcW w:type="dxa" w:w="1134"/>
+          </w:tcPr>
+          <w:p>
+            <w:pPr>
+              <w:spacing w:after="0" w:line="276" w:lineRule="auto"/>
+            </w:pPr>
+            <w:r>
+              <w:rPr>
+                <w:rFonts w:ascii="宋体" w:hAnsi="宋体" w:eastAsia="宋体"/>
+                <w:b w:val="0"/>
+                <w:sz w:val="19"/>
+              </w:rPr>
+              <w:t>Array</w:t>
+            </w:r>
+          </w:p>
+        </w:tc>
+        <w:tc>
+          <w:tcPr>
+            <w:tcW w:type="dxa" w:w="5783"/>
+          </w:tcPr>
+          <w:p>
+            <w:pPr>
+              <w:spacing w:after="0" w:line="276" w:lineRule="auto"/>
+            </w:pPr>
+            <w:r>
+              <w:rPr>
+                <w:rFonts w:ascii="宋体" w:hAnsi="宋体" w:eastAsia="宋体"/>
+                <w:b w:val="0"/>
+                <w:sz w:val="19"/>
+              </w:rPr>
+              <w:t>被采纳的内规条款数组,无关联内规时为 []</w:t>
+            </w:r>
+          </w:p>
+        </w:tc>
+      </w:tr>
+      <w:tr>
+        <w:tc>
+          <w:tcPr>
+            <w:tcW w:type="dxa" w:w="2154"/>
+          </w:tcPr>
+          <w:p>
+            <w:pPr>
+              <w:spacing w:after="0" w:line="276" w:lineRule="auto"/>
+            </w:pPr>
+            <w:r>
+              <w:rPr>
+                <w:rFonts w:ascii="宋体" w:hAnsi="宋体" w:eastAsia="宋体"/>
+                <w:b w:val="0"/>
+                <w:sz w:val="19"/>
+              </w:rPr>
+              <w:t>data[].termContent</w:t>
+            </w:r>
+          </w:p>
+        </w:tc>
+        <w:tc>
+          <w:tcPr>
+            <w:tcW w:type="dxa" w:w="1134"/>
+          </w:tcPr>
+          <w:p>
+            <w:pPr>
+              <w:spacing w:after="0" w:line="276" w:lineRule="auto"/>
+            </w:pPr>
+            <w:r>
+              <w:rPr>
+                <w:rFonts w:ascii="宋体" w:hAnsi="宋体" w:eastAsia="宋体"/>
+                <w:b w:val="0"/>
+                <w:sz w:val="19"/>
+              </w:rPr>
+              <w:t>String</w:t>
+            </w:r>
+          </w:p>
+        </w:tc>
+        <w:tc>
+          <w:tcPr>
+            <w:tcW w:type="dxa" w:w="5783"/>
+          </w:tcPr>
+          <w:p>
+            <w:pPr>
+              <w:spacing w:after="0" w:line="276" w:lineRule="auto"/>
+            </w:pPr>
+            <w:r>
+              <w:rPr>
+                <w:rFonts w:ascii="宋体" w:hAnsi="宋体" w:eastAsia="宋体"/>
+                <w:b w:val="0"/>
+                <w:sz w:val="19"/>
+              </w:rPr>
+              <w:t>条款正文</w:t>
+            </w:r>
+          </w:p>
+        </w:tc>
+      </w:tr>
+      <w:tr>
+        <w:tc>
+          <w:tcPr>
+            <w:tcW w:type="dxa" w:w="2154"/>
+          </w:tcPr>
+          <w:p>
+            <w:pPr>
+              <w:spacing w:after="0" w:line="276" w:lineRule="auto"/>
+            </w:pPr>
+            <w:r>
+              <w:rPr>
+                <w:rFonts w:ascii="宋体" w:hAnsi="宋体" w:eastAsia="宋体"/>
+                <w:b w:val="0"/>
+                <w:sz w:val="19"/>
+              </w:rPr>
+              <w:t>data[].termId</w:t>
+            </w:r>
+          </w:p>
+        </w:tc>
+        <w:tc>
+          <w:tcPr>
+            <w:tcW w:type="dxa" w:w="1134"/>
+          </w:tcPr>
+          <w:p>
+            <w:pPr>
+              <w:spacing w:after="0" w:line="276" w:lineRule="auto"/>
+            </w:pPr>
+            <w:r>
+              <w:rPr>
+                <w:rFonts w:ascii="宋体" w:hAnsi="宋体" w:eastAsia="宋体"/>
+                <w:b w:val="0"/>
+                <w:sz w:val="19"/>
+              </w:rPr>
+              <w:t>String</w:t>
+            </w:r>
+          </w:p>
+        </w:tc>
+        <w:tc>
+          <w:tcPr>
+            <w:tcW w:type="dxa" w:w="5783"/>
+          </w:tcPr>
+          <w:p>
+            <w:pPr>
+              <w:spacing w:after="0" w:line="276" w:lineRule="auto"/>
+            </w:pPr>
+            <w:r>
+              <w:rPr>
+                <w:rFonts w:ascii="宋体" w:hAnsi="宋体" w:eastAsia="宋体"/>
+                <w:b w:val="0"/>
+                <w:sz w:val="19"/>
+              </w:rPr>
+              <w:t>{docId}-{orderNum}</w:t>
+            </w:r>
+          </w:p>
+        </w:tc>
+      </w:tr>
+      <w:tr>
+        <w:tc>
+          <w:tcPr>
+            <w:tcW w:type="dxa" w:w="2154"/>
+          </w:tcPr>
+          <w:p>
+            <w:pPr>
+              <w:spacing w:after="0" w:line="276" w:lineRule="auto"/>
+            </w:pPr>
+            <w:r>
+              <w:rPr>
+                <w:rFonts w:ascii="宋体" w:hAnsi="宋体" w:eastAsia="宋体"/>
+                <w:b w:val="0"/>
+                <w:sz w:val="19"/>
+              </w:rPr>
+              <w:t>data[].termKeyword</w:t>
+            </w:r>
+          </w:p>
+        </w:tc>
+        <w:tc>
+          <w:tcPr>
+            <w:tcW w:type="dxa" w:w="1134"/>
+          </w:tcPr>
+          <w:p>
+            <w:pPr>
+              <w:spacing w:after="0" w:line="276" w:lineRule="auto"/>
+            </w:pPr>
+            <w:r>
+              <w:rPr>
+                <w:rFonts w:ascii="宋体" w:hAnsi="宋体" w:eastAsia="宋体"/>
+                <w:b w:val="0"/>
+                <w:sz w:val="19"/>
+              </w:rPr>
+              <w:t>String</w:t>
+            </w:r>
+          </w:p>
+        </w:tc>
+        <w:tc>
+          <w:tcPr>
+            <w:tcW w:type="dxa" w:w="5783"/>
+          </w:tcPr>
+          <w:p>
+            <w:pPr>
+              <w:spacing w:after="0" w:line="276" w:lineRule="auto"/>
+            </w:pPr>
+            <w:r>
+              <w:rPr>
+                <w:rFonts w:ascii="宋体" w:hAnsi="宋体" w:eastAsia="宋体"/>
+                <w:b w:val="0"/>
+                <w:sz w:val="19"/>
+              </w:rPr>
+              <w:t>条款关键词,本地 jieba 提取</w:t>
+            </w:r>
+          </w:p>
+        </w:tc>
+      </w:tr>
+      <w:tr>
+        <w:tc>
+          <w:tcPr>
+            <w:tcW w:type="dxa" w:w="2154"/>
+          </w:tcPr>
+          <w:p>
+            <w:pPr>
+              <w:spacing w:after="0" w:line="276" w:lineRule="auto"/>
+            </w:pPr>
+            <w:r>
+              <w:rPr>
+                <w:rFonts w:ascii="宋体" w:hAnsi="宋体" w:eastAsia="宋体"/>
+                <w:b w:val="0"/>
+                <w:sz w:val="19"/>
+              </w:rPr>
+              <w:t>data[].termName</w:t>
+            </w:r>
+          </w:p>
+        </w:tc>
+        <w:tc>
+          <w:tcPr>
+            <w:tcW w:type="dxa" w:w="1134"/>
+          </w:tcPr>
+          <w:p>
+            <w:pPr>
+              <w:spacing w:after="0" w:line="276" w:lineRule="auto"/>
+            </w:pPr>
+            <w:r>
+              <w:rPr>
+                <w:rFonts w:ascii="宋体" w:hAnsi="宋体" w:eastAsia="宋体"/>
+                <w:b w:val="0"/>
+                <w:sz w:val="19"/>
+              </w:rPr>
+              <w:t>String</w:t>
+            </w:r>
+          </w:p>
+        </w:tc>
+        <w:tc>
+          <w:tcPr>
+            <w:tcW w:type="dxa" w:w="5783"/>
+          </w:tcPr>
+          <w:p>
+            <w:pPr>
+              <w:spacing w:after="0" w:line="276" w:lineRule="auto"/>
+            </w:pPr>
+            <w:r>
+              <w:rPr>
+                <w:rFonts w:ascii="宋体" w:hAnsi="宋体" w:eastAsia="宋体"/>
+                <w:b w:val="0"/>
+                <w:sz w:val="19"/>
+              </w:rPr>
+              <w:t>条款号(第一条 / Article 1)</w:t>
+            </w:r>
+          </w:p>
+        </w:tc>
+      </w:tr>
+      <w:tr>
+        <w:tc>
+          <w:tcPr>
+            <w:tcW w:type="dxa" w:w="2154"/>
+          </w:tcPr>
+          <w:p>
+            <w:pPr>
+              <w:spacing w:after="0" w:line="276" w:lineRule="auto"/>
+            </w:pPr>
+            <w:r>
+              <w:rPr>
+                <w:rFonts w:ascii="宋体" w:hAnsi="宋体" w:eastAsia="宋体"/>
+                <w:b w:val="0"/>
+                <w:sz w:val="19"/>
+              </w:rPr>
+              <w:t>data[].internalize</w:t>
+            </w:r>
+          </w:p>
+        </w:tc>
+        <w:tc>
+          <w:tcPr>
+            <w:tcW w:type="dxa" w:w="1134"/>
+          </w:tcPr>
+          <w:p>
+            <w:pPr>
+              <w:spacing w:after="0" w:line="276" w:lineRule="auto"/>
+            </w:pPr>
+            <w:r>
+              <w:rPr>
+                <w:rFonts w:ascii="宋体" w:hAnsi="宋体" w:eastAsia="宋体"/>
+                <w:b w:val="0"/>
+                <w:sz w:val="19"/>
+              </w:rPr>
+              <w:t>String</w:t>
+            </w:r>
+          </w:p>
+        </w:tc>
+        <w:tc>
+          <w:tcPr>
+            <w:tcW w:type="dxa" w:w="5783"/>
+          </w:tcPr>
+          <w:p>
+            <w:pPr>
+              <w:spacing w:after="0" w:line="276" w:lineRule="auto"/>
+            </w:pPr>
+            <w:r>
+              <w:rPr>
+                <w:rFonts w:ascii="宋体" w:hAnsi="宋体" w:eastAsia="宋体"/>
+                <w:b w:val="0"/>
+                <w:sz w:val="19"/>
+              </w:rPr>
+              <w:t>需要内化 / 无需内化</w:t>
+            </w:r>
+          </w:p>
+        </w:tc>
+      </w:tr>
+      <w:tr>
+        <w:tc>
+          <w:tcPr>
+            <w:tcW w:type="dxa" w:w="2154"/>
+          </w:tcPr>
+          <w:p>
+            <w:pPr>
+              <w:spacing w:after="0" w:line="276" w:lineRule="auto"/>
+            </w:pPr>
+            <w:r>
+              <w:rPr>
+                <w:rFonts w:ascii="宋体" w:hAnsi="宋体" w:eastAsia="宋体"/>
+                <w:b w:val="0"/>
+                <w:sz w:val="19"/>
+              </w:rPr>
+              <w:t>data[].internalizeReason</w:t>
+            </w:r>
+          </w:p>
+        </w:tc>
+        <w:tc>
+          <w:tcPr>
+            <w:tcW w:type="dxa" w:w="1134"/>
+          </w:tcPr>
+          <w:p>
+            <w:pPr>
+              <w:spacing w:after="0" w:line="276" w:lineRule="auto"/>
+            </w:pPr>
+            <w:r>
+              <w:rPr>
+                <w:rFonts w:ascii="宋体" w:hAnsi="宋体" w:eastAsia="宋体"/>
+                <w:b w:val="0"/>
+                <w:sz w:val="19"/>
+              </w:rPr>
+              <w:t>String</w:t>
+            </w:r>
+          </w:p>
+        </w:tc>
+        <w:tc>
+          <w:tcPr>
+            <w:tcW w:type="dxa" w:w="5783"/>
+          </w:tcPr>
+          <w:p>
+            <w:pPr>
+              <w:spacing w:after="0" w:line="276" w:lineRule="auto"/>
+            </w:pPr>
+            <w:r>
+              <w:rPr>
+                <w:rFonts w:ascii="宋体" w:hAnsi="宋体" w:eastAsia="宋体"/>
+                <w:b w:val="0"/>
+                <w:sz w:val="19"/>
+              </w:rPr>
+              <w:t>内化判定依据</w:t>
+            </w:r>
+          </w:p>
+        </w:tc>
+      </w:tr>
+      <w:tr>
+        <w:tc>
+          <w:tcPr>
+            <w:tcW w:type="dxa" w:w="2154"/>
+          </w:tcPr>
+          <w:p>
+            <w:pPr>
+              <w:spacing w:after="0" w:line="276" w:lineRule="auto"/>
+            </w:pPr>
+            <w:r>
+              <w:rPr>
+                <w:rFonts w:ascii="宋体" w:hAnsi="宋体" w:eastAsia="宋体"/>
+                <w:b w:val="0"/>
+                <w:sz w:val="19"/>
+              </w:rPr>
+              <w:t>data[].coverageStatus</w:t>
+            </w:r>
+          </w:p>
+        </w:tc>
+        <w:tc>
+          <w:tcPr>
+            <w:tcW w:type="dxa" w:w="1134"/>
+          </w:tcPr>
+          <w:p>
+            <w:pPr>
+              <w:spacing w:after="0" w:line="276" w:lineRule="auto"/>
+            </w:pPr>
+            <w:r>
+              <w:rPr>
+                <w:rFonts w:ascii="宋体" w:hAnsi="宋体" w:eastAsia="宋体"/>
+                <w:b w:val="0"/>
+                <w:sz w:val="19"/>
+              </w:rPr>
+              <w:t>String</w:t>
+            </w:r>
+          </w:p>
+        </w:tc>
+        <w:tc>
+          <w:tcPr>
+            <w:tcW w:type="dxa" w:w="5783"/>
+          </w:tcPr>
+          <w:p>
+            <w:pPr>
+              <w:spacing w:after="0" w:line="276" w:lineRule="auto"/>
+            </w:pPr>
+            <w:r>
+              <w:rPr>
+                <w:rFonts w:ascii="宋体" w:hAnsi="宋体" w:eastAsia="宋体"/>
+                <w:b w:val="0"/>
+                <w:sz w:val="19"/>
+              </w:rPr>
+              <w:t>完全覆盖 / 部分覆盖 / 缺失;未执行分析时为空串</w:t>
+            </w:r>
+          </w:p>
+        </w:tc>
+      </w:tr>
+      <w:tr>
+        <w:tc>
+          <w:tcPr>
+            <w:tcW w:type="dxa" w:w="2154"/>
+          </w:tcPr>
+          <w:p>
+            <w:pPr>
+              <w:spacing w:after="0" w:line="276" w:lineRule="auto"/>
+            </w:pPr>
+            <w:r>
+              <w:rPr>
+                <w:rFonts w:ascii="宋体" w:hAnsi="宋体" w:eastAsia="宋体"/>
+                <w:b w:val="0"/>
+                <w:sz w:val="19"/>
+              </w:rPr>
+              <w:t>data[].analysis</w:t>
+            </w:r>
+          </w:p>
+        </w:tc>
+        <w:tc>
+          <w:tcPr>
+            <w:tcW w:type="dxa" w:w="1134"/>
+          </w:tcPr>
+          <w:p>
+            <w:pPr>
+              <w:spacing w:after="0" w:line="276" w:lineRule="auto"/>
+            </w:pPr>
+            <w:r>
+              <w:rPr>
+                <w:rFonts w:ascii="宋体" w:hAnsi="宋体" w:eastAsia="宋体"/>
+                <w:b w:val="0"/>
+                <w:sz w:val="19"/>
+              </w:rPr>
+              <w:t>String</w:t>
+            </w:r>
+          </w:p>
+        </w:tc>
+        <w:tc>
+          <w:tcPr>
+            <w:tcW w:type="dxa" w:w="5783"/>
+          </w:tcPr>
+          <w:p>
+            <w:pPr>
+              <w:spacing w:after="0" w:line="276" w:lineRule="auto"/>
+            </w:pPr>
+            <w:r>
+              <w:rPr>
+                <w:rFonts w:ascii="宋体" w:hAnsi="宋体" w:eastAsia="宋体"/>
+                <w:b w:val="0"/>
+                <w:sz w:val="19"/>
+              </w:rPr>
+              <w:t>覆盖分析;未执行时为空串</w:t>
+            </w:r>
+          </w:p>
+        </w:tc>
+      </w:tr>
+      <w:tr>
+        <w:tc>
+          <w:tcPr>
+            <w:tcW w:type="dxa" w:w="2154"/>
+          </w:tcPr>
+          <w:p>
+            <w:pPr>
+              <w:spacing w:after="0" w:line="276" w:lineRule="auto"/>
+            </w:pPr>
+            <w:r>
+              <w:rPr>
+                <w:rFonts w:ascii="宋体" w:hAnsi="宋体" w:eastAsia="宋体"/>
+                <w:b w:val="0"/>
+                <w:sz w:val="19"/>
+              </w:rPr>
+              <w:t>data[].differenceAnalysis</w:t>
+            </w:r>
+          </w:p>
+        </w:tc>
+        <w:tc>
+          <w:tcPr>
+            <w:tcW w:type="dxa" w:w="1134"/>
+          </w:tcPr>
+          <w:p>
+            <w:pPr>
+              <w:spacing w:after="0" w:line="276" w:lineRule="auto"/>
+            </w:pPr>
+            <w:r>
+              <w:rPr>
+                <w:rFonts w:ascii="宋体" w:hAnsi="宋体" w:eastAsia="宋体"/>
+                <w:b w:val="0"/>
+                <w:sz w:val="19"/>
+              </w:rPr>
+              <w:t>String</w:t>
+            </w:r>
+          </w:p>
+        </w:tc>
+        <w:tc>
+          <w:tcPr>
+            <w:tcW w:type="dxa" w:w="5783"/>
+          </w:tcPr>
+          <w:p>
+            <w:pPr>
+              <w:spacing w:after="0" w:line="276" w:lineRule="auto"/>
+            </w:pPr>
+            <w:r>
+              <w:rPr>
+                <w:rFonts w:ascii="宋体" w:hAnsi="宋体" w:eastAsia="宋体"/>
+                <w:b w:val="0"/>
+                <w:sz w:val="19"/>
+              </w:rPr>
+              <w:t>差异说明;无差异或未执行时为空串</w:t>
+            </w:r>
+          </w:p>
+        </w:tc>
+      </w:tr>
+      <w:tr>
+        <w:tc>
+          <w:tcPr>
+            <w:tcW w:type="dxa" w:w="2154"/>
+          </w:tcPr>
+          <w:p>
+            <w:pPr>
+              <w:spacing w:after="0" w:line="276" w:lineRule="auto"/>
+            </w:pPr>
+            <w:r>
+              <w:rPr>
+                <w:rFonts w:ascii="宋体" w:hAnsi="宋体" w:eastAsia="宋体"/>
+                <w:b w:val="0"/>
+                <w:sz w:val="19"/>
+              </w:rPr>
+              <w:t>data[].coreRequirements</w:t>
+            </w:r>
+          </w:p>
+        </w:tc>
+        <w:tc>
+          <w:tcPr>
+            <w:tcW w:type="dxa" w:w="1134"/>
+          </w:tcPr>
+          <w:p>
+            <w:pPr>
+              <w:spacing w:after="0" w:line="276" w:lineRule="auto"/>
+            </w:pPr>
+            <w:r>
+              <w:rPr>
+                <w:rFonts w:ascii="宋体" w:hAnsi="宋体" w:eastAsia="宋体"/>
+                <w:b w:val="0"/>
+                <w:sz w:val="19"/>
+              </w:rPr>
+              <w:t>String</w:t>
+            </w:r>
+          </w:p>
+        </w:tc>
+        <w:tc>
+          <w:tcPr>
+            <w:tcW w:type="dxa" w:w="5783"/>
+          </w:tcPr>
+          <w:p>
+            <w:pPr>
+              <w:spacing w:after="0" w:line="276" w:lineRule="auto"/>
+            </w:pPr>
+            <w:r>
+              <w:rPr>
+                <w:rFonts w:ascii="宋体" w:hAnsi="宋体" w:eastAsia="宋体"/>
+                <w:b w:val="0"/>
+                <w:sz w:val="19"/>
+              </w:rPr>
+              <w:t>核心监管要求</w:t>
+            </w:r>
+          </w:p>
+        </w:tc>
+      </w:tr>
+      <w:tr>
+        <w:tc>
+          <w:tcPr>
+            <w:tcW w:type="dxa" w:w="2154"/>
+          </w:tcPr>
+          <w:p>
+            <w:pPr>
+              <w:spacing w:after="0" w:line="276" w:lineRule="auto"/>
+            </w:pPr>
+            <w:r>
+              <w:rPr>
+                <w:rFonts w:ascii="宋体" w:hAnsi="宋体" w:eastAsia="宋体"/>
+                <w:b w:val="0"/>
+                <w:sz w:val="19"/>
+              </w:rPr>
+              <w:t>data[].remedySuggestion</w:t>
+            </w:r>
+          </w:p>
+        </w:tc>
+        <w:tc>
+          <w:tcPr>
+            <w:tcW w:type="dxa" w:w="1134"/>
+          </w:tcPr>
+          <w:p>
+            <w:pPr>
+              <w:spacing w:after="0" w:line="276" w:lineRule="auto"/>
+            </w:pPr>
+            <w:r>
+              <w:rPr>
+                <w:rFonts w:ascii="宋体" w:hAnsi="宋体" w:eastAsia="宋体"/>
+                <w:b w:val="0"/>
+                <w:sz w:val="19"/>
+              </w:rPr>
+              <w:t>String</w:t>
+            </w:r>
+          </w:p>
+        </w:tc>
+        <w:tc>
+          <w:tcPr>
+            <w:tcW w:type="dxa" w:w="5783"/>
+          </w:tcPr>
+          <w:p>
+            <w:pPr>
+              <w:spacing w:after="0" w:line="276" w:lineRule="auto"/>
+            </w:pPr>
+            <w:r>
+              <w:rPr>
+                <w:rFonts w:ascii="宋体" w:hAnsi="宋体" w:eastAsia="宋体"/>
+                <w:b w:val="0"/>
+                <w:sz w:val="19"/>
+              </w:rPr>
+              <w:t>整改建议</w:t>
+            </w:r>
+          </w:p>
+        </w:tc>
+      </w:tr>
+      <w:tr>
+        <w:tc>
+          <w:tcPr>
+            <w:tcW w:type="dxa" w:w="2154"/>
+          </w:tcPr>
+          <w:p>
+            <w:pPr>
+              <w:spacing w:after="0" w:line="276" w:lineRule="auto"/>
+            </w:pPr>
+            <w:r>
+              <w:rPr>
+                <w:rFonts w:ascii="宋体" w:hAnsi="宋体" w:eastAsia="宋体"/>
+                <w:b w:val="0"/>
+                <w:sz w:val="19"/>
+              </w:rPr>
+              <w:t>relationTerms[].internalClauseId</w:t>
+            </w:r>
+          </w:p>
+        </w:tc>
+        <w:tc>
+          <w:tcPr>
+            <w:tcW w:type="dxa" w:w="1134"/>
+          </w:tcPr>
+          <w:p>
+            <w:pPr>
+              <w:spacing w:after="0" w:line="276" w:lineRule="auto"/>
+            </w:pPr>
+            <w:r>
+              <w:rPr>
+                <w:rFonts w:ascii="宋体" w:hAnsi="宋体" w:eastAsia="宋体"/>
+                <w:b w:val="0"/>
+                <w:sz w:val="19"/>
+              </w:rPr>
+              <w:t>String</w:t>
+            </w:r>
+          </w:p>
+        </w:tc>
+        <w:tc>
+          <w:tcPr>
+            <w:tcW w:type="dxa" w:w="5783"/>
+          </w:tcPr>
+          <w:p>
+            <w:pPr>
+              <w:spacing w:after="0" w:line="276" w:lineRule="auto"/>
+            </w:pPr>
+            <w:r>
+              <w:rPr>
+                <w:rFonts w:ascii="宋体" w:hAnsi="宋体" w:eastAsia="宋体"/>
+                <w:b w:val="0"/>
+                <w:sz w:val="19"/>
+              </w:rPr>
+              <w:t>内规条款 id</w:t>
+            </w:r>
+          </w:p>
+        </w:tc>
+      </w:tr>
+      <w:tr>
+        <w:tc>
+          <w:tcPr>
+            <w:tcW w:type="dxa" w:w="2154"/>
+          </w:tcPr>
+          <w:p>
+            <w:pPr>
+              <w:spacing w:after="0" w:line="276" w:lineRule="auto"/>
+            </w:pPr>
+            <w:r>
+              <w:rPr>
+                <w:rFonts w:ascii="宋体" w:hAnsi="宋体" w:eastAsia="宋体"/>
+                <w:b w:val="0"/>
+                <w:sz w:val="19"/>
+              </w:rPr>
+              <w:t>relationTerms[].docName</w:t>
+            </w:r>
+          </w:p>
+        </w:tc>
+        <w:tc>
+          <w:tcPr>
+            <w:tcW w:type="dxa" w:w="1134"/>
+          </w:tcPr>
+          <w:p>
+            <w:pPr>
+              <w:spacing w:after="0" w:line="276" w:lineRule="auto"/>
+            </w:pPr>
+            <w:r>
+              <w:rPr>
+                <w:rFonts w:ascii="宋体" w:hAnsi="宋体" w:eastAsia="宋体"/>
+                <w:b w:val="0"/>
+                <w:sz w:val="19"/>
+              </w:rPr>
+              <w:t>String</w:t>
+            </w:r>
+          </w:p>
+        </w:tc>
+        <w:tc>
+          <w:tcPr>
+            <w:tcW w:type="dxa" w:w="5783"/>
+          </w:tcPr>
+          <w:p>
+            <w:pPr>
+              <w:spacing w:after="0" w:line="276" w:lineRule="auto"/>
+            </w:pPr>
+            <w:r>
+              <w:rPr>
+                <w:rFonts w:ascii="宋体" w:hAnsi="宋体" w:eastAsia="宋体"/>
+                <w:b w:val="0"/>
+                <w:sz w:val="19"/>
+              </w:rPr>
+              <w:t>内规制度名称</w:t>
+            </w:r>
+          </w:p>
+        </w:tc>
+      </w:tr>
+      <w:tr>
+        <w:tc>
+          <w:tcPr>
+            <w:tcW w:type="dxa" w:w="2154"/>
+          </w:tcPr>
+          <w:p>
+            <w:pPr>
+              <w:spacing w:after="0" w:line="276" w:lineRule="auto"/>
+            </w:pPr>
+            <w:r>
+              <w:rPr>
+                <w:rFonts w:ascii="宋体" w:hAnsi="宋体" w:eastAsia="宋体"/>
+                <w:b w:val="0"/>
+                <w:sz w:val="19"/>
+              </w:rPr>
+              <w:t>relationTerms[].clauseName</w:t>
+            </w:r>
+          </w:p>
+        </w:tc>
+        <w:tc>
+          <w:tcPr>
+            <w:tcW w:type="dxa" w:w="1134"/>
+          </w:tcPr>
+          <w:p>
+            <w:pPr>
+              <w:spacing w:after="0" w:line="276" w:lineRule="auto"/>
+            </w:pPr>
+            <w:r>
+              <w:rPr>
+                <w:rFonts w:ascii="宋体" w:hAnsi="宋体" w:eastAsia="宋体"/>
+                <w:b w:val="0"/>
+                <w:sz w:val="19"/>
+              </w:rPr>
+              <w:t>String</w:t>
+            </w:r>
+          </w:p>
+        </w:tc>
+        <w:tc>
+          <w:tcPr>
+            <w:tcW w:type="dxa" w:w="5783"/>
+          </w:tcPr>
+          <w:p>
+            <w:pPr>
+              <w:spacing w:after="0" w:line="276" w:lineRule="auto"/>
+            </w:pPr>
+            <w:r>
+              <w:rPr>
+                <w:rFonts w:ascii="宋体" w:hAnsi="宋体" w:eastAsia="宋体"/>
+                <w:b w:val="0"/>
+                <w:sz w:val="19"/>
+              </w:rPr>
+              <w:t>内规条款号</w:t>
+            </w:r>
+          </w:p>
+        </w:tc>
+      </w:tr>
+      <w:tr>
+        <w:tc>
+          <w:tcPr>
+            <w:tcW w:type="dxa" w:w="2154"/>
+          </w:tcPr>
+          <w:p>
+            <w:pPr>
+              <w:spacing w:after="0" w:line="276" w:lineRule="auto"/>
+            </w:pPr>
+            <w:r>
+              <w:rPr>
+                <w:rFonts w:ascii="宋体" w:hAnsi="宋体" w:eastAsia="宋体"/>
+                <w:b w:val="0"/>
+                <w:sz w:val="19"/>
+              </w:rPr>
+              <w:t>relationTerms[].clauseContent</w:t>
+            </w:r>
+          </w:p>
+        </w:tc>
+        <w:tc>
+          <w:tcPr>
+            <w:tcW w:type="dxa" w:w="1134"/>
+          </w:tcPr>
+          <w:p>
+            <w:pPr>
+              <w:spacing w:after="0" w:line="276" w:lineRule="auto"/>
+            </w:pPr>
+            <w:r>
+              <w:rPr>
+                <w:rFonts w:ascii="宋体" w:hAnsi="宋体" w:eastAsia="宋体"/>
+                <w:b w:val="0"/>
+                <w:sz w:val="19"/>
+              </w:rPr>
+              <w:t>String</w:t>
+            </w:r>
+          </w:p>
+        </w:tc>
+        <w:tc>
+          <w:tcPr>
+            <w:tcW w:type="dxa" w:w="5783"/>
+          </w:tcPr>
+          <w:p>
+            <w:pPr>
+              <w:spacing w:after="0" w:line="276" w:lineRule="auto"/>
+            </w:pPr>
+            <w:r>
+              <w:rPr>
+                <w:rFonts w:ascii="宋体" w:hAnsi="宋体" w:eastAsia="宋体"/>
+                <w:b w:val="0"/>
+                <w:sz w:val="19"/>
+              </w:rPr>
+              <w:t>内规条款内容</w:t>
             </w:r>
           </w:p>
         </w:tc>
@@ -4898,7 +5780,7 @@
           <w:b w:val="0"/>
           <w:sz w:val="21"/>
         </w:rPr>
-        <w:t>stages 取值:done=已了结(含上游判定无需执行);failed=执行出错;pending=尚未了结。</w:t>
+        <w:t>data 永远为数组:每个条款一个 dict;不适用、拆条未执行或无条款时为 []，不会为 null。</w:t>
       </w:r>
     </w:p>
     <w:p>
@@ -4912,7 +5794,7 @@
           <w:b w:val="0"/>
           <w:sz w:val="21"/>
         </w:rPr>
-        <w:t>某阶段无结果时,data 下对应字段为 null;不适用时后三阶段为 done 且 data 为 null。</w:t>
+        <w:t>orderNum 为字符串,从 "0" 开始;termId 为 {docId}-{orderNum}，如 REG20261023001-0。</w:t>
       </w:r>
     </w:p>
     <w:p>
@@ -4926,7 +5808,7 @@
           <w:b w:val="0"/>
           <w:sz w:val="21"/>
         </w:rPr>
-        <w:t>coverageRate = (完全覆盖 + 部分覆盖) / 需内化条款数;无需内化条款不计入分母。</w:t>
+        <w:t>applicable 取值 true / false / null(需人工复核);applicableReason 无原因时为空串。</w:t>
       </w:r>
     </w:p>
     <w:p>
@@ -4940,7 +5822,7 @@
           <w:b w:val="0"/>
           <w:sz w:val="21"/>
         </w:rPr>
-        <w:t>relationClauses 只包含被采纳为覆盖依据的内规条款;clauseId 格式为 {docId}_{序号}。</w:t>
+        <w:t>relationTerms 只包含被采纳为覆盖依据的内规条款,无关联内规时为 [];条款类型 clauseType 本次暂不下发。</w:t>
       </w:r>
     </w:p>
     <w:p>
@@ -5081,7 +5963,7 @@
           <w:b w:val="0"/>
           <w:sz w:val="21"/>
         </w:rPr>
-        <w:t>GET /api/v1/clause_splitter/regulations/{docId}/result,响应为统一外层信封 {code, status, data, msg},其中 data 为 5.1 的结果报文;外层 code 为 "200" 表示查询成功,业务结果以报文内的 code 为准。</w:t>
+        <w:t>GET /api/v1/clause_splitter/regulations/{docId}/result,直接返回 5.1 的扁平报文,不再套 {code, status, data, msg} 外层信封;404/500 等错误仍返回统一错误信封(带非 2xx HTTP 状态),请以 HTTP 状态码区分成功与失败。</w:t>
       </w:r>
     </w:p>
     <w:p>

</xml_diff>